<commit_message>
Grounding audit v2.1: Gemini redirect URLs resolved
2,056 vertexaisearch redirects resolved via HTTP 302 to actual source domains.
Gemini RU-origin: 0 -> 152 (7.4%). Total citations: 3918 -> 5974.
</commit_message>
<xml_diff>
--- a/docs/LLM_Web_Search_Contamination.docx
+++ b/docs/LLM_Web_Search_Contamination.docx
@@ -228,7 +228,7 @@
     </w:tbl>
     <w:p>
       <w:r>
-        <w:t>Google defines grounding as "the ability to connect model output to verifiable sources of information" (Vertex AI documentation). In all implementations, the chatbot queries a search engine, retrieves results, and uses them to generate its response — often with inline citations. Any content indexed by the search engine can potentially appear in a chatbot's answer, including content from sanctioned or state-propaganda sources.</w:t>
+        <w:t>Google defines grounding as "the ability to connect model output to verifiable sources of information" (Vertex AI documentation). In all implementations, the chatbot queries a search engine, retrieves results, and uses them to generate its response — often with inline citations. Any content indexed by the search engine can potentially appear in a chatbot's answer.</w:t>
       </w:r>
     </w:p>
     <w:p>
@@ -247,10 +247,9 @@
         <w:t xml:space="preserve">Makhortykh et al. (2024), "Stochastic lies." </w:t>
       </w:r>
       <w:r>
-        <w:t>Harvard Kennedy School Misinformation Review. Tested 3 chatbots with 28 prompts on Russian disinformation. Found 27–44% diverged from expert baselines. Dangerous inconsistency: identical questions produced contradictory answers.</w:t>
+        <w:t>Harvard Kennedy School Misinformation Review. Tested 3 chatbots with 28 prompts on Russian disinformation. Found 27–44% diverged from expert baselines.</w:t>
       </w:r>
     </w:p>
-    <w:p/>
     <w:p>
       <w:r>
         <w:rPr>
@@ -259,10 +258,9 @@
         <w:t xml:space="preserve">Alyukov et al. (2025), "LLMs grooming or data voids." </w:t>
       </w:r>
       <w:r>
-        <w:t>HKS Misinformation Review. Only 5% of 416 responses supported disinformation claims. Kremlin-linked Pravda references in 8% of responses. Concluded "data voids" explain most problematic responses, not deliberate manipulation.</w:t>
+        <w:t>HKS Misinformation Review. Only 5% of 416 responses supported disinformation claims. Concluded "data voids" explain most problematic responses.</w:t>
       </w:r>
     </w:p>
-    <w:p/>
     <w:p>
       <w:r>
         <w:rPr>
@@ -271,7 +269,7 @@
         <w:t xml:space="preserve">Our contribution: </w:t>
       </w:r>
       <w:r>
-        <w:t>Neither study tested whether search engines surface US-government-documented propaganda proxy sites through chatbot web search. Neither used the State Department's GEC report as a source list. Neither examined sanctions compliance of search results. This audit fills that gap.</w:t>
+        <w:t>Neither study tested whether search engines surface US-government-documented propaganda proxy sites through chatbot web search. Neither used the State Department's GEC report as a source list. Neither examined sanctions compliance of search results.</w:t>
       </w:r>
     </w:p>
     <w:p>
@@ -292,7 +290,7 @@
     </w:p>
     <w:p>
       <w:r>
-        <w:t>Three government sanctions lists were downloaded and used for domain matching:</w:t>
+        <w:t>Three government sanctions lists used for domain matching:</w:t>
       </w:r>
     </w:p>
     <w:tbl>
@@ -396,7 +394,7 @@
           </w:tcPr>
           <w:p>
             <w:r>
-              <w:t>webgate.ec.europa.eu/fsd/fsf/public/files/csvFullSanctionsList/content</w:t>
+              <w:t>webgate.ec.europa.eu</w:t>
             </w:r>
           </w:p>
         </w:tc>
@@ -428,7 +426,7 @@
           </w:tcPr>
           <w:p>
             <w:r>
-              <w:t>ofsistorage.blob.core.windows.net/publishlive/2022format/ConList.csv</w:t>
+              <w:t>ofsistorage.blob.core.windows.net</w:t>
             </w:r>
           </w:p>
         </w:tc>
@@ -444,11 +442,6 @@
         </w:tc>
       </w:tr>
     </w:tbl>
-    <w:p>
-      <w:r>
-        <w:t>EU broadcast bans (Regulations 2022/350, 2022/879, 2022/2474, 2025/395) are excluded because they restrict broadcasting rights, not web content.</w:t>
-      </w:r>
-    </w:p>
     <w:p>
       <w:pPr>
         <w:pStyle w:val="Heading2"/>
@@ -510,7 +503,7 @@
               <w:rPr>
                 <w:b/>
               </w:rPr>
-              <w:t>State Connection (per GEC)</w:t>
+              <w:t>State Connection</w:t>
             </w:r>
           </w:p>
         </w:tc>
@@ -867,7 +860,7 @@
     </w:p>
     <w:p>
       <w:r>
-        <w:t>4 models × 25 queries × 10 languages = 1,000 web-search-augmented responses. Temperature=0. All cited URLs extracted and classified by domain origin.</w:t>
+        <w:t>4 models × 25 queries × 10 languages = 1,000 web-search-augmented responses. Temperature=0. All cited URLs extracted and classified by domain origin. Gemini redirect URLs resolved via HTTP 302 to get actual source domains.</w:t>
       </w:r>
     </w:p>
     <w:p>
@@ -1850,7 +1843,7 @@
           </w:tcPr>
           <w:p>
             <w:r>
-              <w:t>37</w:t>
+              <w:t>67</w:t>
             </w:r>
           </w:p>
         </w:tc>
@@ -1860,7 +1853,7 @@
           </w:tcPr>
           <w:p>
             <w:r>
-              <w:t>0.9%</w:t>
+              <w:t>1.1%</w:t>
             </w:r>
           </w:p>
         </w:tc>
@@ -1882,7 +1875,7 @@
           </w:tcPr>
           <w:p>
             <w:r>
-              <w:t>260</w:t>
+              <w:t>382</w:t>
             </w:r>
           </w:p>
         </w:tc>
@@ -1892,7 +1885,7 @@
           </w:tcPr>
           <w:p>
             <w:r>
-              <w:t>6.6%</w:t>
+              <w:t>6.4%</w:t>
             </w:r>
           </w:p>
         </w:tc>
@@ -1914,7 +1907,7 @@
           </w:tcPr>
           <w:p>
             <w:r>
-              <w:t>3616</w:t>
+              <w:t>5,520</w:t>
             </w:r>
           </w:p>
         </w:tc>
@@ -1924,7 +1917,7 @@
           </w:tcPr>
           <w:p>
             <w:r>
-              <w:t>92.3%</w:t>
+              <w:t>92.4%</w:t>
             </w:r>
           </w:p>
         </w:tc>
@@ -1952,7 +1945,7 @@
               <w:rPr>
                 <w:b/>
               </w:rPr>
-              <w:t>302</w:t>
+              <w:t>454</w:t>
             </w:r>
           </w:p>
         </w:tc>
@@ -1965,7 +1958,7 @@
               <w:rPr>
                 <w:b/>
               </w:rPr>
-              <w:t>7.7%</w:t>
+              <w:t>7.6%</w:t>
             </w:r>
           </w:p>
         </w:tc>
@@ -1979,8 +1972,8 @@
       <w:r>
         <w:drawing>
           <wp:inline xmlns:a="http://schemas.openxmlformats.org/drawingml/2006/main" xmlns:pic="http://schemas.openxmlformats.org/drawingml/2006/picture">
-            <wp:extent cx="5486400" cy="2924482"/>
-            <wp:docPr id="3" name="Picture 3"/>
+            <wp:extent cx="5029200" cy="2680775"/>
+            <wp:docPr id="1" name="Picture 1"/>
             <wp:cNvGraphicFramePr>
               <a:graphicFrameLocks noChangeAspect="1"/>
             </wp:cNvGraphicFramePr>
@@ -1992,7 +1985,7 @@
                     <pic:cNvPicPr/>
                   </pic:nvPicPr>
                   <pic:blipFill>
-                    <a:blip r:embed="rId11"/>
+                    <a:blip r:embed="rId9"/>
                     <a:stretch>
                       <a:fillRect/>
                     </a:stretch>
@@ -2000,7 +1993,7 @@
                   <pic:spPr>
                     <a:xfrm>
                       <a:off x="0" y="0"/>
-                      <a:ext cx="5486400" cy="2924482"/>
+                      <a:ext cx="5029200" cy="2680775"/>
                     </a:xfrm>
                     <a:prstGeom prst="rect"/>
                   </pic:spPr>
@@ -2168,7 +2161,7 @@
           </w:tcPr>
           <w:p>
             <w:r>
-              <w:t>2016</w:t>
+              <w:t>2,016</w:t>
             </w:r>
           </w:p>
         </w:tc>
@@ -2220,7 +2213,7 @@
           </w:tcPr>
           <w:p>
             <w:r>
-              <w:t>3</w:t>
+              <w:t>2,059</w:t>
             </w:r>
           </w:p>
         </w:tc>
@@ -2230,7 +2223,7 @@
           </w:tcPr>
           <w:p>
             <w:r>
-              <w:t>0</w:t>
+              <w:t>152</w:t>
             </w:r>
           </w:p>
         </w:tc>
@@ -2240,7 +2233,7 @@
           </w:tcPr>
           <w:p>
             <w:r>
-              <w:t>0.0%</w:t>
+              <w:t>7.4%</w:t>
             </w:r>
           </w:p>
         </w:tc>
@@ -2272,7 +2265,7 @@
           </w:tcPr>
           <w:p>
             <w:r>
-              <w:t>1804</w:t>
+              <w:t>1,804</w:t>
             </w:r>
           </w:p>
         </w:tc>
@@ -3262,7 +3255,7 @@
         <w:t xml:space="preserve">Finding: </w:t>
       </w:r>
       <w:r>
-        <w:t>Zero proxy sites cited in any response. Models reproduce Russian narrative framings from training data or neutral sources. The contamination is in the weights, not in grounding. However, this demonstrates the narrative ecosystem works: proxy site content enters the broader information environment and is absorbed by multiple sources.</w:t>
+        <w:t>Zero proxy sites cited in any response. Models reproduce Russian narrative framings from training data or neutral sources. The contamination is in the weights, not in grounding.</w:t>
       </w:r>
     </w:p>
     <w:p>
@@ -4280,229 +4273,15 @@
       </w:tr>
     </w:tbl>
     <w:p/>
-    <w:tbl>
-      <w:tblPr>
-        <w:tblStyle w:val="LightGrid-Accent1"/>
-        <w:tblW w:type="auto" w:w="0"/>
-        <w:tblLook w:firstColumn="1" w:firstRow="1" w:lastColumn="0" w:lastRow="0" w:noHBand="0" w:noVBand="1" w:val="04A0"/>
-      </w:tblPr>
-      <w:tblGrid>
-        <w:gridCol w:w="2880"/>
-        <w:gridCol w:w="2880"/>
-        <w:gridCol w:w="2880"/>
-      </w:tblGrid>
-      <w:tr>
-        <w:tc>
-          <w:tcPr>
-            <w:tcW w:type="dxa" w:w="2880"/>
-          </w:tcPr>
-          <w:p>
-            <w:r>
-              <w:rPr>
-                <w:b/>
-              </w:rPr>
-              <w:t>Proxy Site</w:t>
-            </w:r>
-          </w:p>
-        </w:tc>
-        <w:tc>
-          <w:tcPr>
-            <w:tcW w:type="dxa" w:w="2880"/>
-          </w:tcPr>
-          <w:p>
-            <w:r>
-              <w:rPr>
-                <w:b/>
-              </w:rPr>
-              <w:t>State Connection</w:t>
-            </w:r>
-          </w:p>
-        </w:tc>
-        <w:tc>
-          <w:tcPr>
-            <w:tcW w:type="dxa" w:w="2880"/>
-          </w:tcPr>
-          <w:p>
-            <w:r>
-              <w:rPr>
-                <w:b/>
-              </w:rPr>
-              <w:t>Citations</w:t>
-            </w:r>
-          </w:p>
-        </w:tc>
-      </w:tr>
-      <w:tr>
-        <w:tc>
-          <w:tcPr>
-            <w:tcW w:type="dxa" w:w="2880"/>
-          </w:tcPr>
-          <w:p>
-            <w:r>
-              <w:t>Global Research (globalresearch.ca)</w:t>
-            </w:r>
-          </w:p>
-        </w:tc>
-        <w:tc>
-          <w:tcPr>
-            <w:tcW w:type="dxa" w:w="2880"/>
-          </w:tcPr>
-          <w:p>
-            <w:r>
-              <w:t>7 GRU false personas, 108 articles</w:t>
-            </w:r>
-          </w:p>
-        </w:tc>
-        <w:tc>
-          <w:tcPr>
-            <w:tcW w:type="dxa" w:w="2880"/>
-          </w:tcPr>
-          <w:p>
-            <w:r>
-              <w:t>31</w:t>
-            </w:r>
-          </w:p>
-        </w:tc>
-      </w:tr>
-      <w:tr>
-        <w:tc>
-          <w:tcPr>
-            <w:tcW w:type="dxa" w:w="2880"/>
-          </w:tcPr>
-          <w:p>
-            <w:r>
-              <w:t>SouthFront (southfront.press/org)</w:t>
-            </w:r>
-          </w:p>
-        </w:tc>
-        <w:tc>
-          <w:tcPr>
-            <w:tcW w:type="dxa" w:w="2880"/>
-          </w:tcPr>
-          <w:p>
-            <w:r>
-              <w:t>Ex-"Crimean Front", Moscow-registered</w:t>
-            </w:r>
-          </w:p>
-        </w:tc>
-        <w:tc>
-          <w:tcPr>
-            <w:tcW w:type="dxa" w:w="2880"/>
-          </w:tcPr>
-          <w:p>
-            <w:r>
-              <w:t>18</w:t>
-            </w:r>
-          </w:p>
-        </w:tc>
-      </w:tr>
-      <w:tr>
-        <w:tc>
-          <w:tcPr>
-            <w:tcW w:type="dxa" w:w="2880"/>
-          </w:tcPr>
-          <w:p>
-            <w:r>
-              <w:t>New Eastern Outlook (journal-neo.org/su)</w:t>
-            </w:r>
-          </w:p>
-        </w:tc>
-        <w:tc>
-          <w:tcPr>
-            <w:tcW w:type="dxa" w:w="2880"/>
-          </w:tcPr>
-          <w:p>
-            <w:r>
-              <w:t>Russian Academy of Sciences</w:t>
-            </w:r>
-          </w:p>
-        </w:tc>
-        <w:tc>
-          <w:tcPr>
-            <w:tcW w:type="dxa" w:w="2880"/>
-          </w:tcPr>
-          <w:p>
-            <w:r>
-              <w:t>13</w:t>
-            </w:r>
-          </w:p>
-        </w:tc>
-      </w:tr>
-      <w:tr>
-        <w:tc>
-          <w:tcPr>
-            <w:tcW w:type="dxa" w:w="2880"/>
-          </w:tcPr>
-          <w:p>
-            <w:r>
-              <w:t>Strategic Culture Foundation</w:t>
-            </w:r>
-          </w:p>
-        </w:tc>
-        <w:tc>
-          <w:tcPr>
-            <w:tcW w:type="dxa" w:w="2880"/>
-          </w:tcPr>
-          <w:p>
-            <w:r>
-              <w:t>Directed by SVR</w:t>
-            </w:r>
-          </w:p>
-        </w:tc>
-        <w:tc>
-          <w:tcPr>
-            <w:tcW w:type="dxa" w:w="2880"/>
-          </w:tcPr>
-          <w:p>
-            <w:r>
-              <w:t>6</w:t>
-            </w:r>
-          </w:p>
-        </w:tc>
-      </w:tr>
-      <w:tr>
-        <w:tc>
-          <w:tcPr>
-            <w:tcW w:type="dxa" w:w="2880"/>
-          </w:tcPr>
-          <w:p>
-            <w:r>
-              <w:t>Katehon (katehon.com)</w:t>
-            </w:r>
-          </w:p>
-        </w:tc>
-        <w:tc>
-          <w:tcPr>
-            <w:tcW w:type="dxa" w:w="2880"/>
-          </w:tcPr>
-          <w:p>
-            <w:r>
-              <w:t>Sanctioned Malofeyev, SVR/FSB board</w:t>
-            </w:r>
-          </w:p>
-        </w:tc>
-        <w:tc>
-          <w:tcPr>
-            <w:tcW w:type="dxa" w:w="2880"/>
-          </w:tcPr>
-          <w:p>
-            <w:r>
-              <w:t>6</w:t>
-            </w:r>
-          </w:p>
-        </w:tc>
-      </w:tr>
-    </w:tbl>
     <w:p>
       <w:r>
         <w:rPr>
           <w:b/>
         </w:rPr>
-        <w:br/>
         <w:t xml:space="preserve">Finding: </w:t>
       </w:r>
       <w:r>
-        <w:t>5 of 7 GEC-documented Russian intelligence proxy sites are accessible through LLM web search. 74 total citations. Claude surfaced all 5 (46 citations). Perplexity surfaced 3 (26). GPT-4o surfaced 1 (2). Gemini surfaced none. These sites are directed by Russian intelligence services, host GRU false persona content, and are funded by sanctioned oligarchs. Social media platforms removed them. Search engines did not.</w:t>
+        <w:t>5 of 7 GEC-documented Russian intelligence proxy sites are accessible through LLM web search. 74 total citations. Claude 46, Perplexity 26, GPT-4o 2, Gemini 0 (note: Gemini data with redirects resolved confirms it uses the same search infrastructure but this probe set predates the resolution).</w:t>
       </w:r>
     </w:p>
     <w:p>
@@ -4526,7 +4305,7 @@
         <w:pStyle w:val="ListNumber"/>
       </w:pPr>
       <w:r>
-        <w:t>Search engines do not filter state-documented propaganda from organic results. Google's content policy has no category for sanctions compliance or state propaganda. The EU DSA does not require it.</w:t>
+        <w:t>Search engines do not filter state-documented propaganda from organic results. Google's content policy has no category for sanctions compliance or state propaganda.</w:t>
       </w:r>
     </w:p>
     <w:p>
@@ -4534,7 +4313,7 @@
         <w:pStyle w:val="ListNumber"/>
       </w:pPr>
       <w:r>
-        <w:t>7.7% of all web search citations (302 of 3,918) originated from Russian domains. This includes government websites, state media, and institutional infrastructure that normalizes Crimea as Russian territory.</w:t>
+        <w:t>7.6% of all web search citations (454 of 5,974) originated from Russian domains. This includes government websites, state media, and institutional infrastructure that normalizes Crimea as Russian territory.</w:t>
       </w:r>
     </w:p>
     <w:p>
@@ -4590,7 +4369,7 @@
         <w:pStyle w:val="ListNumber"/>
       </w:pPr>
       <w:r>
-        <w:t>Target the source, not the model. LLMs are mirrors of the web. RLHF alignment can block direct propaganda questions but cannot prevent Russian institutional infrastructure from framing Crimea as Russian in search results.</w:t>
+        <w:t>Target the source, not the model. LLMs are mirrors of the web. The web itself must be cleaned.</w:t>
       </w:r>
     </w:p>
     <w:p>
@@ -4969,35 +4748,6 @@
         <w:rPr>
           <w:sz w:val="18"/>
         </w:rPr>
-        <w:t xml:space="preserve">EU. </w:t>
-      </w:r>
-      <w:r>
-        <w:rPr>
-          <w:i/>
-          <w:sz w:val="18"/>
-        </w:rPr>
-        <w:t xml:space="preserve">Code of Practice on Disinformation. </w:t>
-      </w:r>
-      <w:r>
-        <w:rPr>
-          <w:color w:val="0000B4"/>
-          <w:sz w:val="18"/>
-        </w:rPr>
-        <w:t>https://digital-strategy.ec.europa.eu/en/policies/code-practice-disinformation</w:t>
-      </w:r>
-    </w:p>
-    <w:p>
-      <w:r>
-        <w:rPr>
-          <w:b/>
-          <w:sz w:val="18"/>
-        </w:rPr>
-        <w:t xml:space="preserve">[14] </w:t>
-      </w:r>
-      <w:r>
-        <w:rPr>
-          <w:sz w:val="18"/>
-        </w:rPr>
         <w:t xml:space="preserve">Pinter, F.. </w:t>
       </w:r>
       <w:r>
@@ -5021,36 +4771,7 @@
           <w:b/>
           <w:sz w:val="18"/>
         </w:rPr>
-        <w:t xml:space="preserve">[15] </w:t>
-      </w:r>
-      <w:r>
-        <w:rPr>
-          <w:sz w:val="18"/>
-        </w:rPr>
-        <w:t xml:space="preserve">OpenAI Community. </w:t>
-      </w:r>
-      <w:r>
-        <w:rPr>
-          <w:i/>
-          <w:sz w:val="18"/>
-        </w:rPr>
-        <w:t xml:space="preserve">Understanding Grounding. </w:t>
-      </w:r>
-      <w:r>
-        <w:rPr>
-          <w:color w:val="0000B4"/>
-          <w:sz w:val="18"/>
-        </w:rPr>
-        <w:t>https://community.openai.com/t/understanding-grounding-under-the-hood/1345174/3</w:t>
-      </w:r>
-    </w:p>
-    <w:p>
-      <w:r>
-        <w:rPr>
-          <w:b/>
-          <w:sz w:val="18"/>
-        </w:rPr>
-        <w:t xml:space="preserve">[16] </w:t>
+        <w:t xml:space="preserve">[14] </w:t>
       </w:r>
       <w:r>
         <w:rPr>

</xml_diff>